<commit_message>
Revise report to use only provided details
</commit_message>
<xml_diff>
--- a/Engineering_Project_Report.docx
+++ b/Engineering_Project_Report.docx
@@ -23,9 +23,9 @@
         <w:rPr>
           <w:rFonts w:ascii="Times New Roman" w:hAnsi="Times New Roman"/>
           <w:b/>
-          <w:sz w:val="32"/>
+          <w:sz w:val="36"/>
         </w:rPr>
-        <w:t>Leaf: High-Performance Web Communication Interface</w:t>
+        <w:t>Indus Flow</w:t>
       </w:r>
     </w:p>
     <w:p>
@@ -38,65 +38,7 @@
           <w:b w:val="0"/>
           <w:sz w:val="28"/>
         </w:rPr>
-        <w:t>Bachelor of Engineering (Undergraduate Project)</w:t>
-      </w:r>
-    </w:p>
-    <w:p>
-      <w:r>
-        <w:br/>
-        <w:br/>
-      </w:r>
-    </w:p>
-    <w:p>
-      <w:pPr>
-        <w:jc w:val="center"/>
-      </w:pPr>
-      <w:r>
-        <w:rPr>
-          <w:rFonts w:ascii="Times New Roman" w:hAnsi="Times New Roman"/>
-          <w:b/>
-          <w:sz w:val="28"/>
-        </w:rPr>
-        <w:t>Prepared By</w:t>
-      </w:r>
-    </w:p>
-    <w:p>
-      <w:pPr>
-        <w:jc w:val="center"/>
-      </w:pPr>
-      <w:r>
-        <w:rPr>
-          <w:rFonts w:ascii="Times New Roman" w:hAnsi="Times New Roman"/>
-          <w:b w:val="0"/>
-          <w:sz w:val="24"/>
-        </w:rPr>
-        <w:t>Project Team</w:t>
-      </w:r>
-    </w:p>
-    <w:p>
-      <w:pPr>
-        <w:jc w:val="center"/>
-      </w:pPr>
-      <w:r>
-        <w:rPr>
-          <w:rFonts w:ascii="Times New Roman" w:hAnsi="Times New Roman"/>
-          <w:b w:val="0"/>
-          <w:sz w:val="24"/>
-        </w:rPr>
-        <w:t>Department of Engineering</w:t>
-      </w:r>
-    </w:p>
-    <w:p>
-      <w:pPr>
-        <w:jc w:val="center"/>
-      </w:pPr>
-      <w:r>
-        <w:rPr>
-          <w:rFonts w:ascii="Times New Roman" w:hAnsi="Times New Roman"/>
-          <w:b w:val="0"/>
-          <w:sz w:val="24"/>
-        </w:rPr>
-        <w:t>Academic Year: 2026</w:t>
+        <w:t>Undergraduate Engineering Project</w:t>
       </w:r>
     </w:p>
     <w:p>
@@ -106,15 +48,10 @@
     </w:p>
     <w:p>
       <w:pPr>
-        <w:jc w:val="center"/>
+        <w:pStyle w:val="Heading1"/>
       </w:pPr>
       <w:r>
-        <w:rPr>
-          <w:rFonts w:ascii="Times New Roman" w:hAnsi="Times New Roman"/>
-          <w:b/>
-          <w:sz w:val="32"/>
-        </w:rPr>
-        <w:t>TITLE PAGE</w:t>
+        <w:t>Title Page</w:t>
       </w:r>
     </w:p>
     <w:p>
@@ -122,7 +59,7 @@
         <w:jc w:val="both"/>
       </w:pPr>
       <w:r>
-        <w:t>Project Title: Leaf - Privacy-First and Lightweight Interactive Web Platform</w:t>
+        <w:t>Project Title: Indus Flow - High-Performance Communication Interface</w:t>
       </w:r>
     </w:p>
     <w:p>
@@ -130,7 +67,7 @@
         <w:jc w:val="both"/>
       </w:pPr>
       <w:r>
-        <w:t>Submitted in partial fulfillment of the requirements for the award of the undergraduate engineering degree.</w:t>
+        <w:t>Submitted in partial fulfillment of undergraduate engineering project requirements.</w:t>
       </w:r>
     </w:p>
     <w:p>
@@ -138,7 +75,7 @@
         <w:jc w:val="both"/>
       </w:pPr>
       <w:r>
-        <w:t>Institution: __________________________</w:t>
+        <w:t>Submitted by: _________________________</w:t>
       </w:r>
     </w:p>
     <w:p>
@@ -146,7 +83,7 @@
         <w:jc w:val="both"/>
       </w:pPr>
       <w:r>
-        <w:t>Department: __________________________</w:t>
+        <w:t>Guide: ________________________________</w:t>
       </w:r>
     </w:p>
     <w:p>
@@ -154,7 +91,7 @@
         <w:jc w:val="both"/>
       </w:pPr>
       <w:r>
-        <w:t>Submitted by: ________________________</w:t>
+        <w:t>Department: ___________________________</w:t>
       </w:r>
     </w:p>
     <w:p>
@@ -162,7 +99,7 @@
         <w:jc w:val="both"/>
       </w:pPr>
       <w:r>
-        <w:t>Guide: _______________________________</w:t>
+        <w:t>Institution: ___________________________</w:t>
       </w:r>
     </w:p>
     <w:p>
@@ -170,7 +107,7 @@
         <w:jc w:val="both"/>
       </w:pPr>
       <w:r>
-        <w:t>Date: ________________________________</w:t>
+        <w:t>Date: _________________________________</w:t>
       </w:r>
     </w:p>
     <w:p>
@@ -191,7 +128,7 @@
         <w:jc w:val="both"/>
       </w:pPr>
       <w:r>
-        <w:t>This is to certify that the project titled "Leaf: High-Performance Web Communication Interface" has been carried out by the above named students under my supervision and is submitted in partial fulfillment of the undergraduate engineering degree requirements.</w:t>
+        <w:t>This is to certify that the project titled "Indus Flow - High-Performance Communication Interface" is a bonafide record of work carried out for undergraduate engineering project requirements.</w:t>
       </w:r>
     </w:p>
     <w:p>
@@ -199,7 +136,7 @@
         <w:jc w:val="both"/>
       </w:pPr>
       <w:r>
-        <w:t>Supervisor Signature: ____________________</w:t>
+        <w:t>Supervisor Signature: _________________________</w:t>
       </w:r>
     </w:p>
     <w:p>
@@ -207,7 +144,7 @@
         <w:jc w:val="both"/>
       </w:pPr>
       <w:r>
-        <w:t>Head of Department: _____________________</w:t>
+        <w:t>Head of Department Signature: _________________</w:t>
       </w:r>
     </w:p>
     <w:p>
@@ -228,7 +165,7 @@
         <w:jc w:val="both"/>
       </w:pPr>
       <w:r>
-        <w:t>We hereby declare that this report is an original work carried out by us and has not been submitted previously for any degree or diploma in this or any other institution. All references used in this work are duly acknowledged.</w:t>
+        <w:t>We declare that this report is our original work and has not been submitted to any other institution for the award of any degree or diploma. All sources are duly acknowledged.</w:t>
       </w:r>
     </w:p>
     <w:p>
@@ -236,7 +173,7 @@
         <w:jc w:val="both"/>
       </w:pPr>
       <w:r>
-        <w:t>Student Signature(s): ____________________</w:t>
+        <w:t>Student Signature(s): _________________________</w:t>
       </w:r>
     </w:p>
     <w:p>
@@ -257,7 +194,7 @@
         <w:jc w:val="both"/>
       </w:pPr>
       <w:r>
-        <w:t>We express our sincere gratitude to our faculty guide, department staff, and peers for their continuous support and technical guidance during this project. Their feedback and encouragement helped us design a scalable and user-focused web application. We are equally thankful to our institution for providing the resources and environment required to complete this work successfully.</w:t>
+        <w:t>We express sincere gratitude to our mentor, faculty members, and peers for their guidance and support throughout this project.</w:t>
       </w:r>
     </w:p>
     <w:p>
@@ -278,13 +215,13 @@
         <w:jc w:val="both"/>
       </w:pPr>
       <w:r>
-        <w:t>Leaf is a modern, high-performance web communication interface developed using a lightweight, privacy-conscious architecture that minimizes asset overhead and improves responsiveness. The system is designed to provide a fluid user experience through modular state management, dynamic UI transitions, and deterministic identity rendering without reliance on heavy media resources. The frontend is built on React 19 with TypeScript and Vite, enabling fast component rendering, stronger type safety, and rapid development through instant hot module replacement.</w:t>
+        <w:t>Indus Flow is a modern, high-performance communication interface developed with a zero asset load overhead strategy. The implementation is built on React 19, TypeScript, and Vite to deliver fast rendering, strong type safety, and rapid development through instant hot-module replacement. State management is handled through Zustand with four focused stores: useAuthStore.ts for login and profile updates, useChatStore.ts for active threads, custom emoji reactions, and simulated Indra AI responses, useUIStore.ts for themes, layout sliders, and audio preferences, and useCallStore.ts for calling overlays and session timers.</w:t>
         <w:br/>
         <w:br/>
-        <w:t>The application integrates Zustand-based global stores for authentication, chat orchestration, interface personalization, and call-session control. Visual consistency and responsiveness are achieved through Tailwind CSS v4 and Framer Motion, while Lucide React supplies a clean icon system across interaction points. Advanced modules include browser-native audio synthesis using the Web Audio API, reducing external sound-file dependencies, and analytics visualization with Recharts for key usage metrics. A privacy-preserving avatar strategy based on deterministic initials gradients further improves load times and removes exposure to personal image assets.</w:t>
+        <w:t>The visual system uses Tailwind CSS v4, Framer Motion, and Lucide React to provide responsive layouts, animated transitions, and clean iconography. Advanced modules include browser-native audio synthesis via Web Audio API oscillators in soundEffects.ts, analytics charts on /analytics using Recharts, and deterministic initials-gradient avatars that preserve privacy while reducing load time by avoiding human photography assets.</w:t>
         <w:br/>
         <w:br/>
-        <w:t>The resulting implementation demonstrates that careful frontend architecture can deliver high interactivity, maintainability, and scalability while preserving performance and user privacy. This report presents the project motivation, design choices, implementation strategy, results, and opportunities for future enhancement.</w:t>
+        <w:t>The outcome demonstrates that a lightweight frontend stack can provide rich interaction, modular control, and high responsiveness without heavy media dependencies.</w:t>
       </w:r>
     </w:p>
     <w:p>
@@ -305,7 +242,7 @@
         <w:jc w:val="both"/>
       </w:pPr>
       <w:r>
-        <w:t>1. Introduction ............................................... 1</w:t>
+        <w:t>Preliminary Pages</w:t>
       </w:r>
     </w:p>
     <w:p>
@@ -313,7 +250,7 @@
         <w:jc w:val="both"/>
       </w:pPr>
       <w:r>
-        <w:t>2. Literature Review ....................................... 5</w:t>
+        <w:t>Chapter 1: Introduction</w:t>
       </w:r>
     </w:p>
     <w:p>
@@ -321,7 +258,7 @@
         <w:jc w:val="both"/>
       </w:pPr>
       <w:r>
-        <w:t>3. System Design ............................................ 9</w:t>
+        <w:t>Chapter 2: Literature Review</w:t>
       </w:r>
     </w:p>
     <w:p>
@@ -329,7 +266,7 @@
         <w:jc w:val="both"/>
       </w:pPr>
       <w:r>
-        <w:t>4. Implementation ......................................... 14</w:t>
+        <w:t>Chapter 3: System Design</w:t>
       </w:r>
     </w:p>
     <w:p>
@@ -337,7 +274,7 @@
         <w:jc w:val="both"/>
       </w:pPr>
       <w:r>
-        <w:t>5. Results and Discussion ............................... 20</w:t>
+        <w:t>Chapter 4: Implementation</w:t>
       </w:r>
     </w:p>
     <w:p>
@@ -345,7 +282,7 @@
         <w:jc w:val="both"/>
       </w:pPr>
       <w:r>
-        <w:t>6. Conclusion and Future Scope ........................ 25</w:t>
+        <w:t>Chapter 5: Results and Discussion</w:t>
       </w:r>
     </w:p>
     <w:p>
@@ -353,7 +290,7 @@
         <w:jc w:val="both"/>
       </w:pPr>
       <w:r>
-        <w:t>References .................................................. 28</w:t>
+        <w:t>Chapter 6: Conclusion and Future Scope</w:t>
       </w:r>
     </w:p>
     <w:p>
@@ -361,7 +298,15 @@
         <w:jc w:val="both"/>
       </w:pPr>
       <w:r>
-        <w:t>Appendices ................................................. 30</w:t>
+        <w:t>References</w:t>
+      </w:r>
+    </w:p>
+    <w:p>
+      <w:pPr>
+        <w:jc w:val="both"/>
+      </w:pPr>
+      <w:r>
+        <w:t>Appendices</w:t>
       </w:r>
     </w:p>
     <w:p>
@@ -382,7 +327,7 @@
         <w:jc w:val="both"/>
       </w:pPr>
       <w:r>
-        <w:t>Figure 3.1 System Architecture Diagram</w:t>
+        <w:t>Figure 3.1 Architecture Diagram</w:t>
       </w:r>
     </w:p>
     <w:p>
@@ -390,7 +335,7 @@
         <w:jc w:val="both"/>
       </w:pPr>
       <w:r>
-        <w:t>Figure 3.2 Block Diagram of Application Modules</w:t>
+        <w:t>Figure 3.2 Block Diagram</w:t>
       </w:r>
     </w:p>
     <w:p>
@@ -398,7 +343,7 @@
         <w:jc w:val="both"/>
       </w:pPr>
       <w:r>
-        <w:t>Figure 5.1 Analytics Dashboard Snapshot</w:t>
+        <w:t>Figure 5.1 Application Interface Screenshot</w:t>
       </w:r>
     </w:p>
     <w:p>
@@ -427,7 +372,7 @@
         <w:jc w:val="both"/>
       </w:pPr>
       <w:r>
-        <w:t>Table 4.1 Core Modules and Responsibilities</w:t>
+        <w:t>Table 4.1 Module Responsibilities</w:t>
       </w:r>
     </w:p>
     <w:p>
@@ -435,7 +380,7 @@
         <w:jc w:val="both"/>
       </w:pPr>
       <w:r>
-        <w:t>Table 5.1 Performance Summary</w:t>
+        <w:t>Table 5.1 Performance Overview</w:t>
       </w:r>
     </w:p>
     <w:p>
@@ -509,7 +454,7 @@
         <w:jc w:val="both"/>
       </w:pPr>
       <w:r>
-        <w:t>Modern communication interfaces require low-latency interactions, privacy-aware identity systems, and adaptive UI modules for engagement and usability.</w:t>
+        <w:t>Modern collaboration applications require fast interaction, modular architecture, and privacy-aware design.</w:t>
       </w:r>
     </w:p>
     <w:p>
@@ -525,7 +470,7 @@
         <w:jc w:val="both"/>
       </w:pPr>
       <w:r>
-        <w:t>Traditional chat dashboards frequently depend on heavy static assets and fragmented state logic, causing slower loads and maintainability issues.</w:t>
+        <w:t>Many communication interfaces rely on heavy assets and fragmented state handling, leading to slower performance and maintainability issues.</w:t>
       </w:r>
     </w:p>
     <w:p>
@@ -541,7 +486,7 @@
         <w:jc w:val="both"/>
       </w:pPr>
       <w:r>
-        <w:t>Design a lightweight, modular, and high-performance frontend with real-time interaction patterns, analytics visibility, and user-centric visual customization.</w:t>
+        <w:t>Develop a high-performance interface with centralized state control, modern design, and responsive interactions.</w:t>
       </w:r>
     </w:p>
     <w:p>
@@ -557,7 +502,7 @@
         <w:jc w:val="both"/>
       </w:pPr>
       <w:r>
-        <w:t>The project focuses on frontend architecture, responsive design, local interaction simulation, and client-side state orchestration.</w:t>
+        <w:t>This work focuses on frontend architecture, interaction modules, visual customization, and analytics presentation.</w:t>
       </w:r>
     </w:p>
     <w:p>
@@ -573,7 +518,7 @@
         <w:jc w:val="both"/>
       </w:pPr>
       <w:r>
-        <w:t>A component-driven development approach was followed, using typed interfaces, centralized stores, iterative UI validation, and feature-wise integration.</w:t>
+        <w:t>A component-driven, store-centric methodology was used with typed development and incremental module integration.</w:t>
       </w:r>
     </w:p>
     <w:p>
@@ -589,7 +534,7 @@
         <w:jc w:val="both"/>
       </w:pPr>
       <w:r>
-        <w:t>This report presents literature insights, system design, implementation details, observed outcomes, and future scope in six chapters.</w:t>
+        <w:t>The report is organized into introduction, review, design, implementation, results, and conclusion chapters.</w:t>
       </w:r>
     </w:p>
     <w:p>
@@ -618,7 +563,7 @@
         <w:jc w:val="both"/>
       </w:pPr>
       <w:r>
-        <w:t>Conventional messaging interfaces often use monolithic state handling and asset-heavy media pipelines, impacting startup and runtime performance.</w:t>
+        <w:t>Traditional systems often combine heavy media assets with less modular state patterns.</w:t>
       </w:r>
     </w:p>
     <w:p>
@@ -634,7 +579,7 @@
         <w:jc w:val="both"/>
       </w:pPr>
       <w:r>
-        <w:t>There is a need for systems that combine rich interactivity, efficient rendering, deterministic identity visuals, and reduced external media dependency.</w:t>
+        <w:t>There is a gap for lightweight interfaces that preserve privacy and maintain high interactivity.</w:t>
       </w:r>
     </w:p>
     <w:p>
@@ -650,7 +595,7 @@
         <w:jc w:val="both"/>
       </w:pPr>
       <w:r>
-        <w:t>Compared to traditional stacks, the proposed architecture improves responsiveness through Vite tooling, modular stores, utility-first styling, and synthesized audio.</w:t>
+        <w:t>The selected stack improves performance and maintainability through modern tooling, typed logic, and modular stores.</w:t>
       </w:r>
     </w:p>
     <w:p>
@@ -679,7 +624,7 @@
         <w:jc w:val="both"/>
       </w:pPr>
       <w:r>
-        <w:t>The architecture follows a layered client model: UI components, state stores, utility modules, and browser-native APIs.</w:t>
+        <w:t>The architecture is centered on React components, Zustand stores, and utility modules.</w:t>
       </w:r>
     </w:p>
     <w:p>
@@ -695,7 +640,7 @@
         <w:jc w:val="both"/>
       </w:pPr>
       <w:r>
-        <w:t>Core blocks include authentication, chat coordination, UI preferences, call overlays, analytics rendering, and synthesized sound engine.</w:t>
+        <w:t>Primary blocks include authentication, chat, UI preferences, call overlay, analytics, and audio synthesis.</w:t>
       </w:r>
     </w:p>
     <w:p>
@@ -711,7 +656,7 @@
         <w:jc w:val="both"/>
       </w:pPr>
       <w:r>
-        <w:t>Flow control was modeled for login/profile updates, message dispatch, emoji reaction handling, and call session lifecycle.</w:t>
+        <w:t>Flowcharts represent user login, messaging actions, reactions, and call session handling.</w:t>
       </w:r>
     </w:p>
     <w:p>
@@ -727,7 +672,7 @@
         <w:jc w:val="both"/>
       </w:pPr>
       <w:r>
-        <w:t>Module interactions can be represented via component and sequence diagrams to visualize store-to-view synchronization.</w:t>
+        <w:t>Component and sequence UML can model store-module interactions.</w:t>
       </w:r>
     </w:p>
     <w:p>
@@ -743,7 +688,7 @@
         <w:jc w:val="both"/>
       </w:pPr>
       <w:r>
-        <w:t>Software: React 19, TypeScript, Vite, Zustand, Tailwind CSS v4, Framer Motion, Lucide React, Recharts. Hardware: Any modern browser-capable system with standard audio output.</w:t>
+        <w:t>Software: React 19, TypeScript, Vite, Zustand, Tailwind CSS v4, Framer Motion, Lucide React, Web Audio API, Recharts. Hardware: standard browser-capable system.</w:t>
       </w:r>
     </w:p>
     <w:p>
@@ -772,7 +717,7 @@
         <w:jc w:val="both"/>
       </w:pPr>
       <w:r>
-        <w:t>useAuthStore.ts handles authentication and profile updates; useChatStore.ts manages message threads and Indra AI simulation; useUIStore.ts manages themes/layout/audio settings; useCallStore.ts controls calling overlays and session timers.</w:t>
+        <w:t>useAuthStore.ts handles login/profile; useChatStore.ts handles messaging, reactions, and Indra AI simulation; useUIStore.ts handles themes/layout/audio; useCallStore.ts controls call overlays and timers.</w:t>
       </w:r>
     </w:p>
     <w:p>
@@ -788,7 +733,7 @@
         <w:jc w:val="both"/>
       </w:pPr>
       <w:r>
-        <w:t>Deterministic avatar generation maps user initials to gradient identities. Event-driven reducers coordinate state updates and UI transitions.</w:t>
+        <w:t>Deterministic initials-gradient avatar generation and event-driven state updates are used across interactions.</w:t>
       </w:r>
     </w:p>
     <w:p>
@@ -804,7 +749,7 @@
         <w:jc w:val="both"/>
       </w:pPr>
       <w:r>
-        <w:t>The current prototype emphasizes frontend state and simulated flows; persistent backend storage can be integrated in future versions.</w:t>
+        <w:t>Database details are not specified in the provided information set.</w:t>
       </w:r>
     </w:p>
     <w:p>
@@ -820,7 +765,7 @@
         <w:jc w:val="both"/>
       </w:pPr>
       <w:r>
-        <w:t>Tailwind CSS utilities drive responsive layout construction; Framer Motion powers spring transitions and modal animations; Web Audio API oscillators in soundEffects.ts generate low-overhead action sounds; Recharts powers /analytics area and pie visualizations.</w:t>
+        <w:t>Tailwind CSS v4 provides utility styling, Framer Motion drives animations, Lucide React delivers icons, Web Audio API synthesizes sound via soundEffects.ts, and Recharts powers /analytics charts.</w:t>
       </w:r>
     </w:p>
     <w:p>
@@ -849,7 +794,7 @@
         <w:jc w:val="both"/>
       </w:pPr>
       <w:r>
-        <w:t>Functional testing validated authentication transitions, chat interactions, call overlays, and analytics rendering flows.</w:t>
+        <w:t>The interface supports dashboard navigation, grouped conversations, chat interactions, call controls, notifications, and analytics view.</w:t>
       </w:r>
     </w:p>
     <w:p>
@@ -865,7 +810,7 @@
         <w:jc w:val="both"/>
       </w:pPr>
       <w:r>
-        <w:t>The zero-heavy-asset strategy reduces startup delays and improves responsiveness during interaction-rich sessions.</w:t>
+        <w:t>Zero asset load overhead and synthesized audio reduce heavy resource dependency and support smoother responsiveness.</w:t>
       </w:r>
     </w:p>
     <w:p>
@@ -881,7 +826,7 @@
         <w:jc w:val="both"/>
       </w:pPr>
       <w:r>
-        <w:t>Representative screenshots include home dashboard, chat panel states, analytics page, and call overlay module.</w:t>
+        <w:t>A provided screenshot shows the dark-themed interface with sidebar navigation, conversation list, active thread panel, workspace details, and shared files/media section.</w:t>
       </w:r>
     </w:p>
     <w:p>
@@ -897,7 +842,7 @@
         <w:jc w:val="both"/>
       </w:pPr>
       <w:r>
-        <w:t>Area and pie charts demonstrate user engagement and feature utilization trends on the analytics route.</w:t>
+        <w:t>Analytics metrics are visualized through Recharts Area and Pie charts on the /analytics page.</w:t>
       </w:r>
     </w:p>
     <w:p>
@@ -913,7 +858,7 @@
         <w:jc w:val="both"/>
       </w:pPr>
       <w:r>
-        <w:t>The implementation confirms that modular state management and browser-native capabilities can produce a responsive and privacy-preserving interface without sacrificing user experience.</w:t>
+        <w:t>The implementation validates that a modern frontend stack can achieve rich UX with strong privacy and efficient runtime behavior.</w:t>
       </w:r>
     </w:p>
     <w:p>
@@ -942,7 +887,7 @@
         <w:jc w:val="both"/>
       </w:pPr>
       <w:r>
-        <w:t>Leaf successfully demonstrates a modern frontend design that balances performance, maintainability, user privacy, and interactive quality.</w:t>
+        <w:t>The project successfully demonstrates a modular and high-performance communication interface using a modern frontend stack.</w:t>
       </w:r>
     </w:p>
     <w:p>
@@ -958,7 +903,7 @@
         <w:jc w:val="both"/>
       </w:pPr>
       <w:r>
-        <w:t>Current limitations include simulated backend responses, limited long-term persistence, and dependence on client-side execution for core behaviors.</w:t>
+        <w:t>The provided details do not include backend persistence architecture or benchmark datasets.</w:t>
       </w:r>
     </w:p>
     <w:p>
@@ -974,7 +919,7 @@
         <w:jc w:val="both"/>
       </w:pPr>
       <w:r>
-        <w:t>Future work may include production backend integration, end-to-end encrypted real-time messaging, richer analytics telemetry, accessibility enhancements, and progressive web app support.</w:t>
+        <w:t>Potential improvements include deeper analytics, backend expansion, and additional collaboration features.</w:t>
       </w:r>
     </w:p>
     <w:p>
@@ -995,7 +940,7 @@
         <w:jc w:val="both"/>
       </w:pPr>
       <w:r>
-        <w:t>[1] Meta Open Source, "React," 2026. [Online]. Available: https://react.dev/</w:t>
+        <w:t>[1] Meta, "React Documentation," [Online]. Available: https://react.dev/.</w:t>
       </w:r>
     </w:p>
     <w:p>
@@ -1003,7 +948,7 @@
         <w:jc w:val="both"/>
       </w:pPr>
       <w:r>
-        <w:t>[2] Microsoft, "TypeScript Documentation," 2026. [Online]. Available: https://www.typescriptlang.org/docs/</w:t>
+        <w:t>[2] Microsoft, "TypeScript Documentation," [Online]. Available: https://www.typescriptlang.org/docs/.</w:t>
       </w:r>
     </w:p>
     <w:p>
@@ -1011,7 +956,7 @@
         <w:jc w:val="both"/>
       </w:pPr>
       <w:r>
-        <w:t>[3] Vite Team, "Vite Guide," 2026. [Online]. Available: https://vite.dev/guide/</w:t>
+        <w:t>[3] Vite Team, "Vite Guide," [Online]. Available: https://vite.dev/guide/.</w:t>
       </w:r>
     </w:p>
     <w:p>
@@ -1019,7 +964,7 @@
         <w:jc w:val="both"/>
       </w:pPr>
       <w:r>
-        <w:t>[4] P. O. M. et al., "Zustand State Management," 2026. [Online]. Available: https://zustand-demo.pmnd.rs/</w:t>
+        <w:t>[4] Zustand, "State Management Library," [Online]. Available: https://zustand-demo.pmnd.rs/.</w:t>
       </w:r>
     </w:p>
     <w:p>
@@ -1027,7 +972,7 @@
         <w:jc w:val="both"/>
       </w:pPr>
       <w:r>
-        <w:t>[5] Tailwind Labs, "Tailwind CSS Documentation," 2026. [Online]. Available: https://tailwindcss.com/docs</w:t>
+        <w:t>[5] Tailwind Labs, "Tailwind CSS Documentation," [Online]. Available: https://tailwindcss.com/docs.</w:t>
       </w:r>
     </w:p>
     <w:p>
@@ -1035,7 +980,7 @@
         <w:jc w:val="both"/>
       </w:pPr>
       <w:r>
-        <w:t>[6] Framer, "Framer Motion Documentation," 2026. [Online]. Available: https://www.framer.com/motion/</w:t>
+        <w:t>[6] Framer, "Framer Motion Documentation," [Online]. Available: https://www.framer.com/motion/.</w:t>
       </w:r>
     </w:p>
     <w:p>
@@ -1043,7 +988,7 @@
         <w:jc w:val="both"/>
       </w:pPr>
       <w:r>
-        <w:t>[7] Recharts Group, "Recharts API," 2026. [Online]. Available: https://recharts.org/en-US</w:t>
+        <w:t>[7] Recharts, "Recharts Documentation," [Online]. Available: https://recharts.org/.</w:t>
       </w:r>
     </w:p>
     <w:p>
@@ -1072,7 +1017,7 @@
         <w:jc w:val="both"/>
       </w:pPr>
       <w:r>
-        <w:t>Refer to the project repository for implementation files and module definitions.</w:t>
+        <w:t>Core modules mentioned: useAuthStore.ts, useChatStore.ts, useUIStore.ts, useCallStore.ts, and soundEffects.ts.</w:t>
       </w:r>
     </w:p>
     <w:p>
@@ -1088,7 +1033,7 @@
         <w:jc w:val="both"/>
       </w:pPr>
       <w:r>
-        <w:t>Include setup, navigation flow, feature guide, and troubleshooting instructions.</w:t>
+        <w:t>Covers dashboard, chat, calls, analytics, settings, workspace details, and secure message interaction flow.</w:t>
       </w:r>
     </w:p>
     <w:p>
@@ -1104,7 +1049,7 @@
         <w:jc w:val="both"/>
       </w:pPr>
       <w:r>
-        <w:t>Add any component-level technical details and third-party package summaries as needed.</w:t>
+        <w:t>Datasheets correspond to React 19, TypeScript, Vite, Zustand, Tailwind CSS v4, Framer Motion, Lucide React, Web Audio API, and Recharts.</w:t>
       </w:r>
     </w:p>
     <w:p>
@@ -1120,7 +1065,7 @@
         <w:jc w:val="both"/>
       </w:pPr>
       <w:r>
-        <w:t>Attach extended screenshots, benchmark notes, and exploratory observations.</w:t>
+        <w:t>Additional screenshots and analytics outputs can be appended.</w:t>
       </w:r>
     </w:p>
     <w:sectPr>

</xml_diff>